<commit_message>
ea report now contains network plots
</commit_message>
<xml_diff>
--- a/data/first_ea/analysis/results_first_ea.docx
+++ b/data/first_ea/analysis/results_first_ea.docx
@@ -1559,6 +1559,273 @@
       </w:r>
     </w:p>
     <w:p/>
+    <w:p>
+      <w:pPr>
+        <w:pStyle w:val="Heading2"/>
+      </w:pPr>
+      <w:r>
+        <w:t>Network Visualizations</w:t>
+      </w:r>
+    </w:p>
+    <w:p>
+      <w:r>
+        <w:drawing>
+          <wp:inline xmlns:a="http://schemas.openxmlformats.org/drawingml/2006/main" xmlns:pic="http://schemas.openxmlformats.org/drawingml/2006/picture">
+            <wp:extent cx="5943600" cy="5422587"/>
+            <wp:docPr id="2" name="Picture 2"/>
+            <wp:cNvGraphicFramePr>
+              <a:graphicFrameLocks noChangeAspect="1"/>
+            </wp:cNvGraphicFramePr>
+            <a:graphic>
+              <a:graphicData uri="http://schemas.openxmlformats.org/drawingml/2006/picture">
+                <pic:pic>
+                  <pic:nvPicPr>
+                    <pic:cNvPr id="0" name="network_first_ea_elite_0.png"/>
+                    <pic:cNvPicPr/>
+                  </pic:nvPicPr>
+                  <pic:blipFill>
+                    <a:blip r:embed="rId10"/>
+                    <a:stretch>
+                      <a:fillRect/>
+                    </a:stretch>
+                  </pic:blipFill>
+                  <pic:spPr>
+                    <a:xfrm>
+                      <a:off x="0" y="0"/>
+                      <a:ext cx="5943600" cy="5422587"/>
+                    </a:xfrm>
+                    <a:prstGeom prst="rect"/>
+                  </pic:spPr>
+                </pic:pic>
+              </a:graphicData>
+            </a:graphic>
+          </wp:inline>
+        </w:drawing>
+      </w:r>
+    </w:p>
+    <w:p/>
+    <w:p>
+      <w:r>
+        <w:drawing>
+          <wp:inline xmlns:a="http://schemas.openxmlformats.org/drawingml/2006/main" xmlns:pic="http://schemas.openxmlformats.org/drawingml/2006/picture">
+            <wp:extent cx="5943600" cy="5422587"/>
+            <wp:docPr id="3" name="Picture 3"/>
+            <wp:cNvGraphicFramePr>
+              <a:graphicFrameLocks noChangeAspect="1"/>
+            </wp:cNvGraphicFramePr>
+            <a:graphic>
+              <a:graphicData uri="http://schemas.openxmlformats.org/drawingml/2006/picture">
+                <pic:pic>
+                  <pic:nvPicPr>
+                    <pic:cNvPr id="0" name="network_first_ea_elite_1.png"/>
+                    <pic:cNvPicPr/>
+                  </pic:nvPicPr>
+                  <pic:blipFill>
+                    <a:blip r:embed="rId11"/>
+                    <a:stretch>
+                      <a:fillRect/>
+                    </a:stretch>
+                  </pic:blipFill>
+                  <pic:spPr>
+                    <a:xfrm>
+                      <a:off x="0" y="0"/>
+                      <a:ext cx="5943600" cy="5422587"/>
+                    </a:xfrm>
+                    <a:prstGeom prst="rect"/>
+                  </pic:spPr>
+                </pic:pic>
+              </a:graphicData>
+            </a:graphic>
+          </wp:inline>
+        </w:drawing>
+      </w:r>
+    </w:p>
+    <w:p/>
+    <w:p>
+      <w:r>
+        <w:drawing>
+          <wp:inline xmlns:a="http://schemas.openxmlformats.org/drawingml/2006/main" xmlns:pic="http://schemas.openxmlformats.org/drawingml/2006/picture">
+            <wp:extent cx="5943600" cy="5422587"/>
+            <wp:docPr id="4" name="Picture 4"/>
+            <wp:cNvGraphicFramePr>
+              <a:graphicFrameLocks noChangeAspect="1"/>
+            </wp:cNvGraphicFramePr>
+            <a:graphic>
+              <a:graphicData uri="http://schemas.openxmlformats.org/drawingml/2006/picture">
+                <pic:pic>
+                  <pic:nvPicPr>
+                    <pic:cNvPr id="0" name="network_first_ea_elite_2.png"/>
+                    <pic:cNvPicPr/>
+                  </pic:nvPicPr>
+                  <pic:blipFill>
+                    <a:blip r:embed="rId12"/>
+                    <a:stretch>
+                      <a:fillRect/>
+                    </a:stretch>
+                  </pic:blipFill>
+                  <pic:spPr>
+                    <a:xfrm>
+                      <a:off x="0" y="0"/>
+                      <a:ext cx="5943600" cy="5422587"/>
+                    </a:xfrm>
+                    <a:prstGeom prst="rect"/>
+                  </pic:spPr>
+                </pic:pic>
+              </a:graphicData>
+            </a:graphic>
+          </wp:inline>
+        </w:drawing>
+      </w:r>
+    </w:p>
+    <w:p/>
+    <w:p>
+      <w:r>
+        <w:drawing>
+          <wp:inline xmlns:a="http://schemas.openxmlformats.org/drawingml/2006/main" xmlns:pic="http://schemas.openxmlformats.org/drawingml/2006/picture">
+            <wp:extent cx="5943600" cy="5422587"/>
+            <wp:docPr id="5" name="Picture 5"/>
+            <wp:cNvGraphicFramePr>
+              <a:graphicFrameLocks noChangeAspect="1"/>
+            </wp:cNvGraphicFramePr>
+            <a:graphic>
+              <a:graphicData uri="http://schemas.openxmlformats.org/drawingml/2006/picture">
+                <pic:pic>
+                  <pic:nvPicPr>
+                    <pic:cNvPr id="0" name="network_connection_weights_hard_wired_lookup_0.png"/>
+                    <pic:cNvPicPr/>
+                  </pic:nvPicPr>
+                  <pic:blipFill>
+                    <a:blip r:embed="rId13"/>
+                    <a:stretch>
+                      <a:fillRect/>
+                    </a:stretch>
+                  </pic:blipFill>
+                  <pic:spPr>
+                    <a:xfrm>
+                      <a:off x="0" y="0"/>
+                      <a:ext cx="5943600" cy="5422587"/>
+                    </a:xfrm>
+                    <a:prstGeom prst="rect"/>
+                  </pic:spPr>
+                </pic:pic>
+              </a:graphicData>
+            </a:graphic>
+          </wp:inline>
+        </w:drawing>
+      </w:r>
+    </w:p>
+    <w:p/>
+    <w:p>
+      <w:r>
+        <w:drawing>
+          <wp:inline xmlns:a="http://schemas.openxmlformats.org/drawingml/2006/main" xmlns:pic="http://schemas.openxmlformats.org/drawingml/2006/picture">
+            <wp:extent cx="5943600" cy="5422587"/>
+            <wp:docPr id="6" name="Picture 6"/>
+            <wp:cNvGraphicFramePr>
+              <a:graphicFrameLocks noChangeAspect="1"/>
+            </wp:cNvGraphicFramePr>
+            <a:graphic>
+              <a:graphicData uri="http://schemas.openxmlformats.org/drawingml/2006/picture">
+                <pic:pic>
+                  <pic:nvPicPr>
+                    <pic:cNvPr id="0" name="network_connection_weights_random_networks_0.png"/>
+                    <pic:cNvPicPr/>
+                  </pic:nvPicPr>
+                  <pic:blipFill>
+                    <a:blip r:embed="rId14"/>
+                    <a:stretch>
+                      <a:fillRect/>
+                    </a:stretch>
+                  </pic:blipFill>
+                  <pic:spPr>
+                    <a:xfrm>
+                      <a:off x="0" y="0"/>
+                      <a:ext cx="5943600" cy="5422587"/>
+                    </a:xfrm>
+                    <a:prstGeom prst="rect"/>
+                  </pic:spPr>
+                </pic:pic>
+              </a:graphicData>
+            </a:graphic>
+          </wp:inline>
+        </w:drawing>
+      </w:r>
+    </w:p>
+    <w:p/>
+    <w:p>
+      <w:r>
+        <w:drawing>
+          <wp:inline xmlns:a="http://schemas.openxmlformats.org/drawingml/2006/main" xmlns:pic="http://schemas.openxmlformats.org/drawingml/2006/picture">
+            <wp:extent cx="5943600" cy="5422587"/>
+            <wp:docPr id="7" name="Picture 7"/>
+            <wp:cNvGraphicFramePr>
+              <a:graphicFrameLocks noChangeAspect="1"/>
+            </wp:cNvGraphicFramePr>
+            <a:graphic>
+              <a:graphicData uri="http://schemas.openxmlformats.org/drawingml/2006/picture">
+                <pic:pic>
+                  <pic:nvPicPr>
+                    <pic:cNvPr id="0" name="network_connection_weights_random_networks_1.png"/>
+                    <pic:cNvPicPr/>
+                  </pic:nvPicPr>
+                  <pic:blipFill>
+                    <a:blip r:embed="rId15"/>
+                    <a:stretch>
+                      <a:fillRect/>
+                    </a:stretch>
+                  </pic:blipFill>
+                  <pic:spPr>
+                    <a:xfrm>
+                      <a:off x="0" y="0"/>
+                      <a:ext cx="5943600" cy="5422587"/>
+                    </a:xfrm>
+                    <a:prstGeom prst="rect"/>
+                  </pic:spPr>
+                </pic:pic>
+              </a:graphicData>
+            </a:graphic>
+          </wp:inline>
+        </w:drawing>
+      </w:r>
+    </w:p>
+    <w:p/>
+    <w:p>
+      <w:r>
+        <w:drawing>
+          <wp:inline xmlns:a="http://schemas.openxmlformats.org/drawingml/2006/main" xmlns:pic="http://schemas.openxmlformats.org/drawingml/2006/picture">
+            <wp:extent cx="5943600" cy="5422587"/>
+            <wp:docPr id="8" name="Picture 8"/>
+            <wp:cNvGraphicFramePr>
+              <a:graphicFrameLocks noChangeAspect="1"/>
+            </wp:cNvGraphicFramePr>
+            <a:graphic>
+              <a:graphicData uri="http://schemas.openxmlformats.org/drawingml/2006/picture">
+                <pic:pic>
+                  <pic:nvPicPr>
+                    <pic:cNvPr id="0" name="network_connection_weights_random_networks_2.png"/>
+                    <pic:cNvPicPr/>
+                  </pic:nvPicPr>
+                  <pic:blipFill>
+                    <a:blip r:embed="rId16"/>
+                    <a:stretch>
+                      <a:fillRect/>
+                    </a:stretch>
+                  </pic:blipFill>
+                  <pic:spPr>
+                    <a:xfrm>
+                      <a:off x="0" y="0"/>
+                      <a:ext cx="5943600" cy="5422587"/>
+                    </a:xfrm>
+                    <a:prstGeom prst="rect"/>
+                  </pic:spPr>
+                </pic:pic>
+              </a:graphicData>
+            </a:graphic>
+          </wp:inline>
+        </w:drawing>
+      </w:r>
+    </w:p>
+    <w:p/>
     <w:sectPr>
       <w:pgSz w:w="12240" w:h="15840"/>
       <w:pgMar w:top="1440" w:right="1800" w:bottom="1440" w:left="1800" w:header="720" w:footer="720" w:gutter="0"/>

</xml_diff>

<commit_message>
ea results report kinda done for now
</commit_message>
<xml_diff>
--- a/data/first_ea/analysis/results_first_ea.docx
+++ b/data/first_ea/analysis/results_first_ea.docx
@@ -2417,11 +2417,233 @@
               <a:graphicData uri="http://schemas.openxmlformats.org/drawingml/2006/picture">
                 <pic:pic>
                   <pic:nvPicPr>
-                    <pic:cNvPr id="0" name="effective_connection_weights_distribution.png"/>
+                    <pic:cNvPr id="0" name="effective_connection_weights_without_zeros_distribution.png"/>
                     <pic:cNvPicPr/>
                   </pic:nvPicPr>
                   <pic:blipFill>
                     <a:blip r:embed="rId19"/>
+                    <a:stretch>
+                      <a:fillRect/>
+                    </a:stretch>
+                  </pic:blipFill>
+                  <pic:spPr>
+                    <a:xfrm>
+                      <a:off x="0" y="0"/>
+                      <a:ext cx="5943600" cy="2935111"/>
+                    </a:xfrm>
+                    <a:prstGeom prst="rect"/>
+                  </pic:spPr>
+                </pic:pic>
+              </a:graphicData>
+            </a:graphic>
+          </wp:inline>
+        </w:drawing>
+      </w:r>
+    </w:p>
+    <w:p/>
+    <w:p>
+      <w:r>
+        <w:drawing>
+          <wp:inline xmlns:a="http://schemas.openxmlformats.org/drawingml/2006/main" xmlns:pic="http://schemas.openxmlformats.org/drawingml/2006/picture">
+            <wp:extent cx="5943600" cy="2935111"/>
+            <wp:docPr id="12" name="Picture 12"/>
+            <wp:cNvGraphicFramePr>
+              <a:graphicFrameLocks noChangeAspect="1"/>
+            </wp:cNvGraphicFramePr>
+            <a:graphic>
+              <a:graphicData uri="http://schemas.openxmlformats.org/drawingml/2006/picture">
+                <pic:pic>
+                  <pic:nvPicPr>
+                    <pic:cNvPr id="0" name="effective_connection_weights_with_zeros_distribution.png"/>
+                    <pic:cNvPicPr/>
+                  </pic:nvPicPr>
+                  <pic:blipFill>
+                    <a:blip r:embed="rId20"/>
+                    <a:stretch>
+                      <a:fillRect/>
+                    </a:stretch>
+                  </pic:blipFill>
+                  <pic:spPr>
+                    <a:xfrm>
+                      <a:off x="0" y="0"/>
+                      <a:ext cx="5943600" cy="2935111"/>
+                    </a:xfrm>
+                    <a:prstGeom prst="rect"/>
+                  </pic:spPr>
+                </pic:pic>
+              </a:graphicData>
+            </a:graphic>
+          </wp:inline>
+        </w:drawing>
+      </w:r>
+    </w:p>
+    <w:p/>
+    <w:p>
+      <w:r>
+        <w:drawing>
+          <wp:inline xmlns:a="http://schemas.openxmlformats.org/drawingml/2006/main" xmlns:pic="http://schemas.openxmlformats.org/drawingml/2006/picture">
+            <wp:extent cx="5943600" cy="2935111"/>
+            <wp:docPr id="13" name="Picture 13"/>
+            <wp:cNvGraphicFramePr>
+              <a:graphicFrameLocks noChangeAspect="1"/>
+            </wp:cNvGraphicFramePr>
+            <a:graphic>
+              <a:graphicData uri="http://schemas.openxmlformats.org/drawingml/2006/picture">
+                <pic:pic>
+                  <pic:nvPicPr>
+                    <pic:cNvPr id="0" name="raw_connection_weights_without_zeros_distribution.png"/>
+                    <pic:cNvPicPr/>
+                  </pic:nvPicPr>
+                  <pic:blipFill>
+                    <a:blip r:embed="rId21"/>
+                    <a:stretch>
+                      <a:fillRect/>
+                    </a:stretch>
+                  </pic:blipFill>
+                  <pic:spPr>
+                    <a:xfrm>
+                      <a:off x="0" y="0"/>
+                      <a:ext cx="5943600" cy="2935111"/>
+                    </a:xfrm>
+                    <a:prstGeom prst="rect"/>
+                  </pic:spPr>
+                </pic:pic>
+              </a:graphicData>
+            </a:graphic>
+          </wp:inline>
+        </w:drawing>
+      </w:r>
+    </w:p>
+    <w:p/>
+    <w:p>
+      <w:r>
+        <w:drawing>
+          <wp:inline xmlns:a="http://schemas.openxmlformats.org/drawingml/2006/main" xmlns:pic="http://schemas.openxmlformats.org/drawingml/2006/picture">
+            <wp:extent cx="5943600" cy="2935111"/>
+            <wp:docPr id="14" name="Picture 14"/>
+            <wp:cNvGraphicFramePr>
+              <a:graphicFrameLocks noChangeAspect="1"/>
+            </wp:cNvGraphicFramePr>
+            <a:graphic>
+              <a:graphicData uri="http://schemas.openxmlformats.org/drawingml/2006/picture">
+                <pic:pic>
+                  <pic:nvPicPr>
+                    <pic:cNvPr id="0" name="raw_connection_weights_with_zeros_distribution.png"/>
+                    <pic:cNvPicPr/>
+                  </pic:nvPicPr>
+                  <pic:blipFill>
+                    <a:blip r:embed="rId22"/>
+                    <a:stretch>
+                      <a:fillRect/>
+                    </a:stretch>
+                  </pic:blipFill>
+                  <pic:spPr>
+                    <a:xfrm>
+                      <a:off x="0" y="0"/>
+                      <a:ext cx="5943600" cy="2935111"/>
+                    </a:xfrm>
+                    <a:prstGeom prst="rect"/>
+                  </pic:spPr>
+                </pic:pic>
+              </a:graphicData>
+            </a:graphic>
+          </wp:inline>
+        </w:drawing>
+      </w:r>
+    </w:p>
+    <w:p/>
+    <w:p>
+      <w:r>
+        <w:drawing>
+          <wp:inline xmlns:a="http://schemas.openxmlformats.org/drawingml/2006/main" xmlns:pic="http://schemas.openxmlformats.org/drawingml/2006/picture">
+            <wp:extent cx="5943600" cy="2935111"/>
+            <wp:docPr id="15" name="Picture 15"/>
+            <wp:cNvGraphicFramePr>
+              <a:graphicFrameLocks noChangeAspect="1"/>
+            </wp:cNvGraphicFramePr>
+            <a:graphic>
+              <a:graphicData uri="http://schemas.openxmlformats.org/drawingml/2006/picture">
+                <pic:pic>
+                  <pic:nvPicPr>
+                    <pic:cNvPr id="0" name="connection_reliability_without_zeros_distribution.png"/>
+                    <pic:cNvPicPr/>
+                  </pic:nvPicPr>
+                  <pic:blipFill>
+                    <a:blip r:embed="rId23"/>
+                    <a:stretch>
+                      <a:fillRect/>
+                    </a:stretch>
+                  </pic:blipFill>
+                  <pic:spPr>
+                    <a:xfrm>
+                      <a:off x="0" y="0"/>
+                      <a:ext cx="5943600" cy="2935111"/>
+                    </a:xfrm>
+                    <a:prstGeom prst="rect"/>
+                  </pic:spPr>
+                </pic:pic>
+              </a:graphicData>
+            </a:graphic>
+          </wp:inline>
+        </w:drawing>
+      </w:r>
+    </w:p>
+    <w:p/>
+    <w:p>
+      <w:r>
+        <w:drawing>
+          <wp:inline xmlns:a="http://schemas.openxmlformats.org/drawingml/2006/main" xmlns:pic="http://schemas.openxmlformats.org/drawingml/2006/picture">
+            <wp:extent cx="5943600" cy="2935111"/>
+            <wp:docPr id="16" name="Picture 16"/>
+            <wp:cNvGraphicFramePr>
+              <a:graphicFrameLocks noChangeAspect="1"/>
+            </wp:cNvGraphicFramePr>
+            <a:graphic>
+              <a:graphicData uri="http://schemas.openxmlformats.org/drawingml/2006/picture">
+                <pic:pic>
+                  <pic:nvPicPr>
+                    <pic:cNvPr id="0" name="connection_reliability_with_zeros_distribution.png"/>
+                    <pic:cNvPicPr/>
+                  </pic:nvPicPr>
+                  <pic:blipFill>
+                    <a:blip r:embed="rId24"/>
+                    <a:stretch>
+                      <a:fillRect/>
+                    </a:stretch>
+                  </pic:blipFill>
+                  <pic:spPr>
+                    <a:xfrm>
+                      <a:off x="0" y="0"/>
+                      <a:ext cx="5943600" cy="2935111"/>
+                    </a:xfrm>
+                    <a:prstGeom prst="rect"/>
+                  </pic:spPr>
+                </pic:pic>
+              </a:graphicData>
+            </a:graphic>
+          </wp:inline>
+        </w:drawing>
+      </w:r>
+    </w:p>
+    <w:p/>
+    <w:p>
+      <w:r>
+        <w:drawing>
+          <wp:inline xmlns:a="http://schemas.openxmlformats.org/drawingml/2006/main" xmlns:pic="http://schemas.openxmlformats.org/drawingml/2006/picture">
+            <wp:extent cx="5943600" cy="2935111"/>
+            <wp:docPr id="17" name="Picture 17"/>
+            <wp:cNvGraphicFramePr>
+              <a:graphicFrameLocks noChangeAspect="1"/>
+            </wp:cNvGraphicFramePr>
+            <a:graphic>
+              <a:graphicData uri="http://schemas.openxmlformats.org/drawingml/2006/picture">
+                <pic:pic>
+                  <pic:nvPicPr>
+                    <pic:cNvPr id="0" name="modulation_weights_distribution.png"/>
+                    <pic:cNvPicPr/>
+                  </pic:nvPicPr>
+                  <pic:blipFill>
+                    <a:blip r:embed="rId25"/>
                     <a:stretch>
                       <a:fillRect/>
                     </a:stretch>

</xml_diff>